<commit_message>
Add code-traceability doc: each step -> Python file + exact lines
Per user: link every thing done to the Python code and the exact lines.

- NEW reports/tracabilite_code_FR.md (+ Tracabilite_code_FR.docx): a French map from
  each item (config/assumptions, engine, analysis steps, single-alternative Step A,
  robustness, optimiser, figures T1-T4, unit tests) to file.py:line-range, with the
  pipeline run order. Names the function as the stable anchor if lines shift.
- guide_pas_a_pas.md: file map now points to the traceability doc.
- build_docx.py: builds the traceability doc; skip the empty figure appendix when a
  document has no figure list.

No analytical results changed.

Co-Authored-By: Claude Opus 4.8 <noreply@anthropic.com>
Claude-Session: https://claude.ai/code/session_01BpRuhc2aBcap5ePk6Ra9LE
</commit_message>
<xml_diff>
--- a/reports/docx/Guide_pas_a_pas_FR.docx
+++ b/reports/docx/Guide_pas_a_pas_FR.docx
@@ -4211,6 +4211,39 @@
                 <w:rStyle w:val="VerbatimChar"/>
               </w:rPr>
               <w:t xml:space="preserve">docs/methodology.md</w:t>
+            </w:r>
+          </w:p>
+        </w:tc>
+      </w:tr>
+      <w:tr>
+        <w:tc>
+          <w:tcPr/>
+          <w:p>
+            <w:pPr>
+              <w:pStyle w:val="Compact"/>
+              <w:jc w:val="left"/>
+            </w:pPr>
+            <w:r>
+              <w:rPr>
+                <w:bCs/>
+                <w:b/>
+              </w:rPr>
+              <w:t xml:space="preserve">Où se trouve chaque calcul dans le code (lignes exactes)</w:t>
+            </w:r>
+          </w:p>
+        </w:tc>
+        <w:tc>
+          <w:tcPr/>
+          <w:p>
+            <w:pPr>
+              <w:pStyle w:val="Compact"/>
+              <w:jc w:val="left"/>
+            </w:pPr>
+            <w:r>
+              <w:rPr>
+                <w:rStyle w:val="VerbatimChar"/>
+              </w:rPr>
+              <w:t xml:space="preserve">reports/tracabilite_code_FR.md</w:t>
             </w:r>
           </w:p>
         </w:tc>

</xml_diff>